<commit_message>
Viet Anh CV: keep n8n, drop only Google Gemini
Per clarification, re-introduced n8n (summary, built-section, skills, tools) and
kept Google Gemini removed. n8n is a listed plus for this role. One page.

Co-Authored-By: Claude Opus 4.8 <noreply@anthropic.com>
Claude-Session: https://claude.ai/code/session_016GBJepJH2uCBQFQXE7m6cc
</commit_message>
<xml_diff>
--- a/cv/Soyli_Sahedova_CV_VietAnh.docx
+++ b/cv/Soyli_Sahedova_CV_VietAnh.docx
@@ -235,7 +235,7 @@
           <w:color w:val="1B1915"/>
           <w:sz w:val="19"/>
         </w:rPr>
-        <w:t>automations that cut manual work</w:t>
+        <w:t>automations in n8n that cut manual work</w:t>
       </w:r>
       <w:r>
         <w:rPr>
@@ -336,7 +336,7 @@
           <w:color w:val="1B1915"/>
           <w:sz w:val="19"/>
         </w:rPr>
-        <w:t>Automated lead workflow</w:t>
+        <w:t>Automated lead workflow (n8n)</w:t>
       </w:r>
       <w:r>
         <w:rPr>
@@ -400,7 +400,7 @@
           <w:color w:val="1B1915"/>
           <w:sz w:val="19"/>
         </w:rPr>
-        <w:t>AI for Marketing Content · AI Image &amp; Video · Marketing Automation &amp; Workflows · Lead Capture, Sorting &amp; CRM · Email &amp; Follow-up Automation · Chatbots &amp; Conversational AI · AI Tool Research &amp; Testing · Process Optimization · Team Training &amp; Documentation · Copywriting (English) · Paid &amp; Organic Marketing · Analytics &amp; Reporting · Canva · Adobe Creative Suite · Figma</w:t>
+        <w:t>AI for Marketing Content · AI Image &amp; Video · Marketing Automation &amp; Workflows (n8n) · Lead Capture, Sorting &amp; CRM · Email &amp; Follow-up Automation · Chatbots &amp; Conversational AI · AI Tool Research &amp; Testing · Process Optimization · Team Training &amp; Documentation · Copywriting (English) · Paid &amp; Organic Marketing · Analytics &amp; Reporting · Canva · Adobe Creative Suite · Figma</w:t>
       </w:r>
     </w:p>
     <w:p>
@@ -791,7 +791,7 @@
           <w:color w:val="1B1915"/>
           <w:sz w:val="19"/>
         </w:rPr>
-        <w:t>AI assistants (ChatGPT, Claude) · Canva AI · Adobe Creative Suite · Figma · Canva · CRM &amp; automation platforms · Meta &amp; Google Ads · Analytics</w:t>
+        <w:t>AI assistants (ChatGPT, Claude) · Canva AI · Adobe Creative Suite · Figma · Canva · n8n · CRM &amp; automation platforms · Meta &amp; Google Ads · Analytics</w:t>
       </w:r>
     </w:p>
     <w:p>

</xml_diff>